<commit_message>
exam 5th 2 completed with keys
</commit_message>
<xml_diff>
--- a/25-26/5th grade/exam 2/exam2 5th.docx
+++ b/25-26/5th grade/exam 2/exam2 5th.docx
@@ -105,7 +105,7 @@
           <w:szCs w:val="28"/>
           <w14:ligatures w14:val="none"/>
         </w:rPr>
-        <w:t>My mother is 38 years old. She is kind and beautiful.</w:t>
+        <w:t>All around the world, people live in different types of houses. That depends</w:t>
       </w:r>
       <w:r>
         <w:rPr>
@@ -127,7 +127,7 @@
           <w:szCs w:val="28"/>
           <w14:ligatures w14:val="none"/>
         </w:rPr>
-        <w:t>She has got short brown hair. She works as a teacher</w:t>
+        <w:t>on the environment. People live in flats, houses or villas with big swimming</w:t>
       </w:r>
       <w:r>
         <w:rPr>
@@ -149,7 +149,7 @@
           <w:szCs w:val="28"/>
           <w14:ligatures w14:val="none"/>
         </w:rPr>
-        <w:t>in a school. She cooks very well. She does all the</w:t>
+        <w:t>pools.</w:t>
       </w:r>
       <w:r>
         <w:rPr>
@@ -171,7 +171,7 @@
           <w:szCs w:val="28"/>
           <w14:ligatures w14:val="none"/>
         </w:rPr>
-        <w:t>housework. She often helps me do my homework. She</w:t>
+        <w:t>Eskimos live in igloos. Igloos are made of huge blocks of ice. In</w:t>
       </w:r>
       <w:r>
         <w:rPr>
@@ -193,7 +193,7 @@
           <w:szCs w:val="28"/>
           <w14:ligatures w14:val="none"/>
         </w:rPr>
-        <w:t>sometimes plays with me. She loves my brother and</w:t>
+        <w:t>some hot countries, people live in huts made of mud, straw and leaves</w:t>
       </w:r>
       <w:r>
         <w:rPr>
@@ -215,7 +215,7 @@
           <w:szCs w:val="28"/>
           <w14:ligatures w14:val="none"/>
         </w:rPr>
-        <w:t>me very much.</w:t>
+        <w:t>with no windows.</w:t>
       </w:r>
     </w:p>
     <w:p>
@@ -263,7 +263,7 @@
           <w:sz w:val="28"/>
           <w:szCs w:val="28"/>
         </w:rPr>
-        <w:t xml:space="preserve">My mother </w:t>
+        <w:t xml:space="preserve">Some Native Americans live in </w:t>
       </w:r>
       <w:r>
         <w:rPr>
@@ -281,25 +281,25 @@
           <w:sz w:val="28"/>
           <w:szCs w:val="28"/>
         </w:rPr>
-        <w:t xml:space="preserve"> </w:t>
-      </w:r>
-      <w:r>
-        <w:rPr>
-          <w:b/>
-          <w:bCs/>
-          <w:sz w:val="28"/>
-          <w:szCs w:val="28"/>
-        </w:rPr>
-        <w:t>is / are</w:t>
-      </w:r>
-      <w:r>
-        <w:rPr>
-          <w:b/>
-          <w:bCs/>
-          <w:sz w:val="28"/>
-          <w:szCs w:val="28"/>
-        </w:rPr>
-        <w:t xml:space="preserve"> </w:t>
+        <w:t xml:space="preserve"> villas</w:t>
+      </w:r>
+      <w:r>
+        <w:rPr>
+          <w:b/>
+          <w:bCs/>
+          <w:sz w:val="28"/>
+          <w:szCs w:val="28"/>
+        </w:rPr>
+        <w:t xml:space="preserve"> / </w:t>
+      </w:r>
+      <w:r>
+        <w:rPr>
+          <w:b/>
+          <w:bCs/>
+          <w:sz w:val="28"/>
+          <w:szCs w:val="28"/>
+        </w:rPr>
+        <w:t xml:space="preserve">teepees </w:t>
       </w:r>
       <w:r>
         <w:rPr>
@@ -315,7 +315,7 @@
           <w:sz w:val="28"/>
           <w:szCs w:val="28"/>
         </w:rPr>
-        <w:t xml:space="preserve"> 38 years old.</w:t>
+        <w:t>.</w:t>
       </w:r>
     </w:p>
     <w:p>
@@ -333,13 +333,6 @@
       </w:pPr>
       <w:r>
         <w:rPr>
-          <w:sz w:val="28"/>
-          <w:szCs w:val="28"/>
-        </w:rPr>
-        <w:t xml:space="preserve">She </w:t>
-      </w:r>
-      <w:r>
-        <w:rPr>
           <w:b/>
           <w:bCs/>
           <w:sz w:val="28"/>
@@ -354,41 +347,55 @@
           <w:sz w:val="28"/>
           <w:szCs w:val="28"/>
         </w:rPr>
+        <w:t xml:space="preserve"> Igloos</w:t>
+      </w:r>
+      <w:r>
+        <w:rPr>
+          <w:b/>
+          <w:bCs/>
+          <w:sz w:val="28"/>
+          <w:szCs w:val="28"/>
+        </w:rPr>
+        <w:t xml:space="preserve"> / </w:t>
+      </w:r>
+      <w:r>
+        <w:rPr>
+          <w:b/>
+          <w:bCs/>
+          <w:sz w:val="28"/>
+          <w:szCs w:val="28"/>
+        </w:rPr>
+        <w:t>Huts</w:t>
+      </w:r>
+      <w:r>
+        <w:rPr>
+          <w:b/>
+          <w:bCs/>
+          <w:sz w:val="28"/>
+          <w:szCs w:val="28"/>
+        </w:rPr>
+        <w:t>)</w:t>
+      </w:r>
+      <w:r>
+        <w:rPr>
+          <w:sz w:val="28"/>
+          <w:szCs w:val="28"/>
+        </w:rPr>
         <w:t xml:space="preserve"> </w:t>
       </w:r>
       <w:r>
         <w:rPr>
-          <w:b/>
-          <w:bCs/>
-          <w:sz w:val="28"/>
-          <w:szCs w:val="28"/>
-        </w:rPr>
-        <w:t>have / has</w:t>
-      </w:r>
-      <w:r>
-        <w:rPr>
-          <w:b/>
-          <w:bCs/>
-          <w:sz w:val="28"/>
-          <w:szCs w:val="28"/>
-        </w:rPr>
-        <w:t xml:space="preserve"> </w:t>
-      </w:r>
-      <w:r>
-        <w:rPr>
-          <w:b/>
-          <w:bCs/>
-          <w:sz w:val="28"/>
-          <w:szCs w:val="28"/>
-        </w:rPr>
-        <w:t>)</w:t>
-      </w:r>
-      <w:r>
-        <w:rPr>
-          <w:sz w:val="28"/>
-          <w:szCs w:val="28"/>
-        </w:rPr>
-        <w:t xml:space="preserve"> got short hair.</w:t>
+          <w:sz w:val="28"/>
+          <w:szCs w:val="28"/>
+        </w:rPr>
+        <w:t>are made of mud, straw and leaves</w:t>
+      </w:r>
+      <w:r>
+        <w:rPr>
+          <w:sz w:val="28"/>
+          <w:szCs w:val="28"/>
+        </w:rPr>
+        <w:t>.</w:t>
       </w:r>
     </w:p>
     <w:p>
@@ -409,7 +416,14 @@
           <w:sz w:val="28"/>
           <w:szCs w:val="28"/>
         </w:rPr>
-        <w:t xml:space="preserve">She </w:t>
+        <w:t>Igloos are made of</w:t>
+      </w:r>
+      <w:r>
+        <w:rPr>
+          <w:sz w:val="28"/>
+          <w:szCs w:val="28"/>
+        </w:rPr>
+        <w:t xml:space="preserve"> </w:t>
       </w:r>
       <w:r>
         <w:rPr>
@@ -427,41 +441,55 @@
           <w:sz w:val="28"/>
           <w:szCs w:val="28"/>
         </w:rPr>
+        <w:t xml:space="preserve"> igloos</w:t>
+      </w:r>
+      <w:r>
+        <w:rPr>
+          <w:b/>
+          <w:bCs/>
+          <w:sz w:val="28"/>
+          <w:szCs w:val="28"/>
+        </w:rPr>
+        <w:t xml:space="preserve"> / </w:t>
+      </w:r>
+      <w:r>
+        <w:rPr>
+          <w:b/>
+          <w:bCs/>
+          <w:sz w:val="28"/>
+          <w:szCs w:val="28"/>
+        </w:rPr>
+        <w:t xml:space="preserve">huts </w:t>
+      </w:r>
+      <w:r>
+        <w:rPr>
+          <w:b/>
+          <w:bCs/>
+          <w:sz w:val="28"/>
+          <w:szCs w:val="28"/>
+        </w:rPr>
+        <w:t>)</w:t>
+      </w:r>
+      <w:r>
+        <w:rPr>
+          <w:sz w:val="28"/>
+          <w:szCs w:val="28"/>
+        </w:rPr>
         <w:t xml:space="preserve"> </w:t>
       </w:r>
       <w:r>
         <w:rPr>
-          <w:b/>
-          <w:bCs/>
-          <w:sz w:val="28"/>
-          <w:szCs w:val="28"/>
-        </w:rPr>
-        <w:t>work / works</w:t>
-      </w:r>
-      <w:r>
-        <w:rPr>
-          <w:b/>
-          <w:bCs/>
-          <w:sz w:val="28"/>
-          <w:szCs w:val="28"/>
-        </w:rPr>
-        <w:t xml:space="preserve"> </w:t>
-      </w:r>
-      <w:r>
-        <w:rPr>
-          <w:b/>
-          <w:bCs/>
-          <w:sz w:val="28"/>
-          <w:szCs w:val="28"/>
-        </w:rPr>
-        <w:t>)</w:t>
-      </w:r>
-      <w:r>
-        <w:rPr>
-          <w:sz w:val="28"/>
-          <w:szCs w:val="28"/>
-        </w:rPr>
-        <w:t xml:space="preserve"> as a teacher.</w:t>
+          <w:sz w:val="28"/>
+          <w:szCs w:val="28"/>
+        </w:rPr>
+        <w:t>blocks of ice</w:t>
+      </w:r>
+      <w:r>
+        <w:rPr>
+          <w:sz w:val="28"/>
+          <w:szCs w:val="28"/>
+        </w:rPr>
+        <w:t>.</w:t>
       </w:r>
     </w:p>
     <w:p>
@@ -524,7 +552,14 @@
           <w:sz w:val="28"/>
           <w:szCs w:val="28"/>
         </w:rPr>
-        <w:t>Does she cook very well?...............................................................</w:t>
+        <w:t>Where do Eskimos live</w:t>
+      </w:r>
+      <w:r>
+        <w:rPr>
+          <w:sz w:val="28"/>
+          <w:szCs w:val="28"/>
+        </w:rPr>
+        <w:t>?...............................................................</w:t>
       </w:r>
     </w:p>
     <w:p>
@@ -545,14 +580,7 @@
           <w:sz w:val="28"/>
           <w:szCs w:val="28"/>
         </w:rPr>
-        <w:t>How old is the</w:t>
-      </w:r>
-      <w:r>
-        <w:rPr>
-          <w:sz w:val="28"/>
-          <w:szCs w:val="28"/>
-        </w:rPr>
-        <w:t xml:space="preserve"> she</w:t>
+        <w:t>Do huts have windows</w:t>
       </w:r>
       <w:r>
         <w:rPr>
@@ -691,26 +719,55 @@
       </w:pPr>
       <w:r>
         <w:rPr>
-          <w:sz w:val="28"/>
-          <w:szCs w:val="28"/>
-        </w:rPr>
-        <w:t xml:space="preserve">We </w:t>
-      </w:r>
-      <w:r>
-        <w:rPr>
-          <w:b/>
-          <w:bCs/>
-          <w:sz w:val="28"/>
-          <w:szCs w:val="28"/>
-        </w:rPr>
-        <w:t xml:space="preserve">( have to / has to ) </w:t>
-      </w:r>
-      <w:r>
-        <w:rPr>
-          <w:sz w:val="28"/>
-          <w:szCs w:val="28"/>
-        </w:rPr>
-        <w:t>listen to the teacher.</w:t>
+          <w:b/>
+          <w:bCs/>
+          <w:sz w:val="28"/>
+          <w:szCs w:val="28"/>
+        </w:rPr>
+        <w:t xml:space="preserve">( </w:t>
+      </w:r>
+      <w:r>
+        <w:rPr>
+          <w:b/>
+          <w:bCs/>
+          <w:sz w:val="28"/>
+          <w:szCs w:val="28"/>
+        </w:rPr>
+        <w:t>How many</w:t>
+      </w:r>
+      <w:r>
+        <w:rPr>
+          <w:b/>
+          <w:bCs/>
+          <w:sz w:val="28"/>
+          <w:szCs w:val="28"/>
+        </w:rPr>
+        <w:t xml:space="preserve"> / </w:t>
+      </w:r>
+      <w:r>
+        <w:rPr>
+          <w:b/>
+          <w:bCs/>
+          <w:sz w:val="28"/>
+          <w:szCs w:val="28"/>
+        </w:rPr>
+        <w:t>How much</w:t>
+      </w:r>
+      <w:r>
+        <w:rPr>
+          <w:b/>
+          <w:bCs/>
+          <w:sz w:val="28"/>
+          <w:szCs w:val="28"/>
+        </w:rPr>
+        <w:t xml:space="preserve"> ) </w:t>
+      </w:r>
+      <w:r>
+        <w:rPr>
+          <w:sz w:val="28"/>
+          <w:szCs w:val="28"/>
+        </w:rPr>
+        <w:t>sugar do you put in your tea?</w:t>
       </w:r>
     </w:p>
     <w:p>
@@ -732,23 +789,73 @@
           <w:sz w:val="28"/>
           <w:szCs w:val="28"/>
         </w:rPr>
-        <w:t xml:space="preserve">She </w:t>
-      </w:r>
-      <w:r>
-        <w:rPr>
-          <w:b/>
-          <w:bCs/>
-          <w:sz w:val="28"/>
-          <w:szCs w:val="28"/>
-        </w:rPr>
-        <w:t xml:space="preserve">( have to / has to ) </w:t>
-      </w:r>
-      <w:r>
-        <w:rPr>
-          <w:sz w:val="28"/>
-          <w:szCs w:val="28"/>
-        </w:rPr>
-        <w:t>wear a school uniform.</w:t>
+        <w:t>Bees move their wings to</w:t>
+      </w:r>
+      <w:r>
+        <w:rPr>
+          <w:sz w:val="28"/>
+          <w:szCs w:val="28"/>
+        </w:rPr>
+        <w:t xml:space="preserve"> </w:t>
+      </w:r>
+      <w:r>
+        <w:rPr>
+          <w:b/>
+          <w:bCs/>
+          <w:sz w:val="28"/>
+          <w:szCs w:val="28"/>
+        </w:rPr>
+        <w:t xml:space="preserve">( </w:t>
+      </w:r>
+      <w:r>
+        <w:rPr>
+          <w:b/>
+          <w:bCs/>
+          <w:sz w:val="28"/>
+          <w:szCs w:val="28"/>
+        </w:rPr>
+        <w:t>made</w:t>
+      </w:r>
+      <w:r>
+        <w:rPr>
+          <w:b/>
+          <w:bCs/>
+          <w:sz w:val="28"/>
+          <w:szCs w:val="28"/>
+        </w:rPr>
+        <w:t xml:space="preserve"> / </w:t>
+      </w:r>
+      <w:r>
+        <w:rPr>
+          <w:b/>
+          <w:bCs/>
+          <w:sz w:val="28"/>
+          <w:szCs w:val="28"/>
+        </w:rPr>
+        <w:t>make</w:t>
+      </w:r>
+      <w:r>
+        <w:rPr>
+          <w:b/>
+          <w:bCs/>
+          <w:sz w:val="28"/>
+          <w:szCs w:val="28"/>
+        </w:rPr>
+        <w:t xml:space="preserve"> ) </w:t>
+      </w:r>
+      <w:r>
+        <w:rPr>
+          <w:sz w:val="28"/>
+          <w:szCs w:val="28"/>
+        </w:rPr>
+        <w:t>the hive cool</w:t>
+      </w:r>
+      <w:r>
+        <w:rPr>
+          <w:sz w:val="28"/>
+          <w:szCs w:val="28"/>
+        </w:rPr>
+        <w:t>.</w:t>
       </w:r>
     </w:p>
     <w:p>
@@ -770,7 +877,21 @@
           <w:sz w:val="28"/>
           <w:szCs w:val="28"/>
         </w:rPr>
-        <w:t xml:space="preserve">He is Lara </w:t>
+        <w:t xml:space="preserve"> </w:t>
+      </w:r>
+      <w:r>
+        <w:rPr>
+          <w:sz w:val="28"/>
+          <w:szCs w:val="28"/>
+        </w:rPr>
+        <w:t>M</w:t>
+      </w:r>
+      <w:r>
+        <w:rPr>
+          <w:sz w:val="28"/>
+          <w:szCs w:val="28"/>
+        </w:rPr>
+        <w:t xml:space="preserve">aha travels to </w:t>
       </w:r>
       <w:r>
         <w:rPr>
@@ -788,6 +909,24 @@
           <w:sz w:val="28"/>
           <w:szCs w:val="28"/>
         </w:rPr>
+        <w:t xml:space="preserve"> Aleppo </w:t>
+      </w:r>
+      <w:r>
+        <w:rPr>
+          <w:b/>
+          <w:bCs/>
+          <w:sz w:val="28"/>
+          <w:szCs w:val="28"/>
+        </w:rPr>
+        <w:t>/</w:t>
+      </w:r>
+      <w:r>
+        <w:rPr>
+          <w:b/>
+          <w:bCs/>
+          <w:sz w:val="28"/>
+          <w:szCs w:val="28"/>
+        </w:rPr>
         <w:t xml:space="preserve"> </w:t>
       </w:r>
       <w:r>
@@ -797,15 +936,6 @@
           <w:sz w:val="28"/>
           <w:szCs w:val="28"/>
         </w:rPr>
-        <w:t xml:space="preserve">' </w:t>
-      </w:r>
-      <w:r>
-        <w:rPr>
-          <w:b/>
-          <w:bCs/>
-          <w:sz w:val="28"/>
-          <w:szCs w:val="28"/>
-        </w:rPr>
         <w:t xml:space="preserve"> </w:t>
       </w:r>
       <w:r>
@@ -815,12 +945,19 @@
           <w:sz w:val="28"/>
           <w:szCs w:val="28"/>
         </w:rPr>
-        <w:t>/</w:t>
-      </w:r>
-      <w:r>
-        <w:rPr>
-          <w:b/>
-          <w:bCs/>
+        <w:t>aleppo</w:t>
+      </w:r>
+      <w:r>
+        <w:rPr>
+          <w:b/>
+          <w:bCs/>
+          <w:sz w:val="28"/>
+          <w:szCs w:val="28"/>
+        </w:rPr>
+        <w:t xml:space="preserve"> )</w:t>
+      </w:r>
+      <w:r>
+        <w:rPr>
           <w:sz w:val="28"/>
           <w:szCs w:val="28"/>
         </w:rPr>
@@ -828,19 +965,10 @@
       </w:r>
       <w:r>
         <w:rPr>
-          <w:b/>
-          <w:bCs/>
-          <w:sz w:val="28"/>
-          <w:szCs w:val="28"/>
-        </w:rPr>
-        <w:t xml:space="preserve"> 's )</w:t>
-      </w:r>
-      <w:r>
-        <w:rPr>
-          <w:sz w:val="28"/>
-          <w:szCs w:val="28"/>
-        </w:rPr>
-        <w:t xml:space="preserve"> uncle</w:t>
+          <w:sz w:val="28"/>
+          <w:szCs w:val="28"/>
+        </w:rPr>
+        <w:t xml:space="preserve"> every month</w:t>
       </w:r>
       <w:r>
         <w:rPr>
@@ -869,21 +997,10 @@
           <w:sz w:val="28"/>
           <w:szCs w:val="28"/>
         </w:rPr>
-        <w:t xml:space="preserve">What do you usually </w:t>
-      </w:r>
-      <w:r>
-        <w:rPr>
-          <w:b/>
-          <w:bCs/>
-          <w:sz w:val="28"/>
-          <w:szCs w:val="28"/>
-        </w:rPr>
-        <w:t xml:space="preserve">( do / does ) </w:t>
-      </w:r>
-      <w:r>
-        <w:rPr>
-          <w:b/>
-          <w:bCs/>
+        <w:t xml:space="preserve">There isn’t </w:t>
+      </w:r>
+      <w:r>
+        <w:rPr>
           <w:sz w:val="28"/>
           <w:szCs w:val="28"/>
         </w:rPr>
@@ -891,10 +1008,64 @@
       </w:r>
       <w:r>
         <w:rPr>
-          <w:sz w:val="28"/>
-          <w:szCs w:val="28"/>
-        </w:rPr>
-        <w:t>in the morning</w:t>
+          <w:b/>
+          <w:bCs/>
+          <w:sz w:val="28"/>
+          <w:szCs w:val="28"/>
+        </w:rPr>
+        <w:t xml:space="preserve">( </w:t>
+      </w:r>
+      <w:r>
+        <w:rPr>
+          <w:b/>
+          <w:bCs/>
+          <w:sz w:val="28"/>
+          <w:szCs w:val="28"/>
+        </w:rPr>
+        <w:t>some</w:t>
+      </w:r>
+      <w:r>
+        <w:rPr>
+          <w:b/>
+          <w:bCs/>
+          <w:sz w:val="28"/>
+          <w:szCs w:val="28"/>
+        </w:rPr>
+        <w:t xml:space="preserve"> / </w:t>
+      </w:r>
+      <w:r>
+        <w:rPr>
+          <w:b/>
+          <w:bCs/>
+          <w:sz w:val="28"/>
+          <w:szCs w:val="28"/>
+        </w:rPr>
+        <w:t>any</w:t>
+      </w:r>
+      <w:r>
+        <w:rPr>
+          <w:b/>
+          <w:bCs/>
+          <w:sz w:val="28"/>
+          <w:szCs w:val="28"/>
+        </w:rPr>
+        <w:t xml:space="preserve"> ) </w:t>
+      </w:r>
+      <w:r>
+        <w:rPr>
+          <w:b/>
+          <w:bCs/>
+          <w:sz w:val="28"/>
+          <w:szCs w:val="28"/>
+        </w:rPr>
+        <w:t xml:space="preserve"> </w:t>
+      </w:r>
+      <w:r>
+        <w:rPr>
+          <w:sz w:val="28"/>
+          <w:szCs w:val="28"/>
+        </w:rPr>
+        <w:t>coffee left</w:t>
       </w:r>
       <w:r>
         <w:rPr>
@@ -923,23 +1094,80 @@
           <w:sz w:val="28"/>
           <w:szCs w:val="28"/>
         </w:rPr>
-        <w:t xml:space="preserve">Lili never </w:t>
-      </w:r>
-      <w:r>
-        <w:rPr>
-          <w:b/>
-          <w:bCs/>
-          <w:sz w:val="28"/>
-          <w:szCs w:val="28"/>
-        </w:rPr>
-        <w:t xml:space="preserve">( play / plays ) </w:t>
-      </w:r>
-      <w:r>
-        <w:rPr>
-          <w:sz w:val="28"/>
-          <w:szCs w:val="28"/>
-        </w:rPr>
-        <w:t xml:space="preserve"> the piano at night.</w:t>
+        <w:t>There</w:t>
+      </w:r>
+      <w:r>
+        <w:rPr>
+          <w:sz w:val="28"/>
+          <w:szCs w:val="28"/>
+        </w:rPr>
+        <w:t xml:space="preserve"> </w:t>
+      </w:r>
+      <w:r>
+        <w:rPr>
+          <w:b/>
+          <w:bCs/>
+          <w:sz w:val="28"/>
+          <w:szCs w:val="28"/>
+        </w:rPr>
+        <w:t xml:space="preserve">( </w:t>
+      </w:r>
+      <w:r>
+        <w:rPr>
+          <w:b/>
+          <w:bCs/>
+          <w:sz w:val="28"/>
+          <w:szCs w:val="28"/>
+        </w:rPr>
+        <w:t>is</w:t>
+      </w:r>
+      <w:r>
+        <w:rPr>
+          <w:b/>
+          <w:bCs/>
+          <w:sz w:val="28"/>
+          <w:szCs w:val="28"/>
+        </w:rPr>
+        <w:t xml:space="preserve"> / </w:t>
+      </w:r>
+      <w:r>
+        <w:rPr>
+          <w:b/>
+          <w:bCs/>
+          <w:sz w:val="28"/>
+          <w:szCs w:val="28"/>
+        </w:rPr>
+        <w:t>are</w:t>
+      </w:r>
+      <w:r>
+        <w:rPr>
+          <w:b/>
+          <w:bCs/>
+          <w:sz w:val="28"/>
+          <w:szCs w:val="28"/>
+        </w:rPr>
+        <w:t xml:space="preserve"> ) </w:t>
+      </w:r>
+      <w:r>
+        <w:rPr>
+          <w:sz w:val="28"/>
+          <w:szCs w:val="28"/>
+        </w:rPr>
+        <w:t xml:space="preserve"> </w:t>
+      </w:r>
+      <w:r>
+        <w:rPr>
+          <w:sz w:val="28"/>
+          <w:szCs w:val="28"/>
+        </w:rPr>
+        <w:t>some butter in the fridge</w:t>
+      </w:r>
+      <w:r>
+        <w:rPr>
+          <w:sz w:val="28"/>
+          <w:szCs w:val="28"/>
+        </w:rPr>
+        <w:t>.</w:t>
       </w:r>
     </w:p>
     <w:p>
@@ -1077,7 +1305,7 @@
                 <w:sz w:val="28"/>
                 <w:szCs w:val="28"/>
               </w:rPr>
-              <w:t>library</w:t>
+              <w:t>huts</w:t>
             </w:r>
           </w:p>
         </w:tc>
@@ -1107,7 +1335,7 @@
                 <w:sz w:val="28"/>
                 <w:szCs w:val="28"/>
               </w:rPr>
-              <w:t>computer lab</w:t>
+              <w:t>animal</w:t>
             </w:r>
           </w:p>
         </w:tc>
@@ -1137,7 +1365,7 @@
                 <w:sz w:val="28"/>
                 <w:szCs w:val="28"/>
               </w:rPr>
-              <w:t>classroom</w:t>
+              <w:t>building</w:t>
             </w:r>
           </w:p>
         </w:tc>
@@ -1167,16 +1395,7 @@
                 <w:sz w:val="28"/>
                 <w:szCs w:val="28"/>
               </w:rPr>
-              <w:t>B</w:t>
-            </w:r>
-            <w:r>
-              <w:rPr>
-                <w:b w:val="0"/>
-                <w:bCs w:val="0"/>
-                <w:sz w:val="28"/>
-                <w:szCs w:val="28"/>
-              </w:rPr>
-              <w:t>athroom</w:t>
+              <w:t>different</w:t>
             </w:r>
           </w:p>
         </w:tc>
@@ -1206,7 +1425,7 @@
                 <w:sz w:val="28"/>
                 <w:szCs w:val="28"/>
               </w:rPr>
-              <w:t>playground</w:t>
+              <w:t>igloos</w:t>
             </w:r>
           </w:p>
         </w:tc>
@@ -1231,7 +1450,21 @@
           <w:sz w:val="28"/>
           <w:szCs w:val="28"/>
         </w:rPr>
-        <w:t>I wash my hands in the……………………..</w:t>
+        <w:t>Teepees are made of …………</w:t>
+      </w:r>
+      <w:r>
+        <w:rPr>
+          <w:sz w:val="28"/>
+          <w:szCs w:val="28"/>
+        </w:rPr>
+        <w:t>…….</w:t>
+      </w:r>
+      <w:r>
+        <w:rPr>
+          <w:sz w:val="28"/>
+          <w:szCs w:val="28"/>
+        </w:rPr>
+        <w:t>skin.</w:t>
       </w:r>
     </w:p>
     <w:p>
@@ -1253,14 +1486,21 @@
           <w:sz w:val="28"/>
           <w:szCs w:val="28"/>
         </w:rPr>
-        <w:t>I borrow books from the</w:t>
-      </w:r>
-      <w:r>
-        <w:rPr>
-          <w:sz w:val="28"/>
-          <w:szCs w:val="28"/>
-        </w:rPr>
-        <w:t>……………………</w:t>
+        <w:t>People live in …………</w:t>
+      </w:r>
+      <w:r>
+        <w:rPr>
+          <w:sz w:val="28"/>
+          <w:szCs w:val="28"/>
+        </w:rPr>
+        <w:t>………….</w:t>
+      </w:r>
+      <w:r>
+        <w:rPr>
+          <w:sz w:val="28"/>
+          <w:szCs w:val="28"/>
+        </w:rPr>
+        <w:t xml:space="preserve"> types of homes.</w:t>
       </w:r>
     </w:p>
     <w:p>
@@ -1282,14 +1522,21 @@
           <w:sz w:val="28"/>
           <w:szCs w:val="28"/>
         </w:rPr>
-        <w:t>There are sixteen desks in our</w:t>
-      </w:r>
-      <w:r>
-        <w:rPr>
-          <w:sz w:val="28"/>
-          <w:szCs w:val="28"/>
-        </w:rPr>
         <w:t>…………………..</w:t>
+      </w:r>
+      <w:r>
+        <w:rPr>
+          <w:sz w:val="28"/>
+          <w:szCs w:val="28"/>
+        </w:rPr>
+        <w:t>have no windows</w:t>
+      </w:r>
+      <w:r>
+        <w:rPr>
+          <w:sz w:val="28"/>
+          <w:szCs w:val="28"/>
+        </w:rPr>
+        <w:t>.</w:t>
       </w:r>
     </w:p>
     <w:p>
@@ -1311,7 +1558,7 @@
           <w:sz w:val="28"/>
           <w:szCs w:val="28"/>
         </w:rPr>
-        <w:t>They work on computers in the</w:t>
+        <w:t xml:space="preserve">Some people live in an apartment </w:t>
       </w:r>
       <w:r>
         <w:rPr>
@@ -1440,14 +1687,7 @@
                 <w:sz w:val="28"/>
                 <w:szCs w:val="28"/>
               </w:rPr>
-              <w:t>When you have a question</w:t>
-            </w:r>
-            <w:r>
-              <w:rPr>
-                <w:sz w:val="28"/>
-                <w:szCs w:val="28"/>
-              </w:rPr>
-              <w:t>,</w:t>
+              <w:t>This is your racket</w:t>
             </w:r>
           </w:p>
         </w:tc>
@@ -1474,7 +1714,7 @@
                 <w:sz w:val="28"/>
                 <w:szCs w:val="28"/>
               </w:rPr>
-              <w:t>You have to come to class on time.</w:t>
+              <w:t>when she fell off.</w:t>
             </w:r>
           </w:p>
         </w:tc>
@@ -1506,7 +1746,7 @@
                 <w:sz w:val="28"/>
                 <w:szCs w:val="28"/>
               </w:rPr>
-              <w:t>When you need something,</w:t>
+              <w:t>He was playing baseball</w:t>
             </w:r>
           </w:p>
         </w:tc>
@@ -1533,7 +1773,7 @@
                 <w:sz w:val="28"/>
                 <w:szCs w:val="28"/>
               </w:rPr>
-              <w:t>you have to say please and thank you.</w:t>
+              <w:t>This racket is yours.</w:t>
             </w:r>
           </w:p>
         </w:tc>
@@ -1565,7 +1805,7 @@
                 <w:sz w:val="28"/>
                 <w:szCs w:val="28"/>
               </w:rPr>
-              <w:t>There’s a canteen in the school,</w:t>
+              <w:t>She was doing gymnastics</w:t>
             </w:r>
           </w:p>
         </w:tc>
@@ -1592,7 +1832,7 @@
                 <w:sz w:val="28"/>
                 <w:szCs w:val="28"/>
               </w:rPr>
-              <w:t>you have to raise your hand.</w:t>
+              <w:t>This whistle is mine.</w:t>
             </w:r>
           </w:p>
         </w:tc>
@@ -1621,7 +1861,7 @@
                 <w:sz w:val="28"/>
                 <w:szCs w:val="28"/>
               </w:rPr>
-              <w:t>Don't be late.</w:t>
+              <w:t>This is my whistle</w:t>
             </w:r>
           </w:p>
         </w:tc>
@@ -1648,14 +1888,7 @@
                 <w:sz w:val="28"/>
                 <w:szCs w:val="28"/>
               </w:rPr>
-              <w:t>you don't have to bring a</w:t>
-            </w:r>
-            <w:r>
-              <w:rPr>
-                <w:sz w:val="28"/>
-                <w:szCs w:val="28"/>
-              </w:rPr>
-              <w:t xml:space="preserve"> sandwich</w:t>
+              <w:t>when the time was over.</w:t>
             </w:r>
           </w:p>
         </w:tc>
@@ -1700,7 +1933,14 @@
           <w:sz w:val="28"/>
           <w:szCs w:val="28"/>
         </w:rPr>
-        <w:t>your Daily Routine</w:t>
+        <w:t xml:space="preserve">your </w:t>
+      </w:r>
+      <w:r>
+        <w:rPr>
+          <w:sz w:val="28"/>
+          <w:szCs w:val="28"/>
+        </w:rPr>
+        <w:t>future job</w:t>
       </w:r>
       <w:r>
         <w:rPr>
@@ -1716,7 +1956,26 @@
           <w:sz w:val="28"/>
           <w:szCs w:val="28"/>
         </w:rPr>
-        <w:t xml:space="preserve">                                    /14m/</w:t>
+        <w:t xml:space="preserve">                              </w:t>
+      </w:r>
+      <w:r>
+        <w:rPr>
+          <w:b/>
+          <w:bCs/>
+          <w:sz w:val="28"/>
+          <w:szCs w:val="28"/>
+        </w:rPr>
+        <w:tab/>
+        <w:t xml:space="preserve">    </w:t>
+      </w:r>
+      <w:r>
+        <w:rPr>
+          <w:b/>
+          <w:bCs/>
+          <w:sz w:val="28"/>
+          <w:szCs w:val="28"/>
+        </w:rPr>
+        <w:t xml:space="preserve">      /14m/</w:t>
       </w:r>
     </w:p>
     <w:p>
@@ -1741,14 +2000,70 @@
           <w:sz w:val="28"/>
           <w:szCs w:val="28"/>
         </w:rPr>
-        <w:t xml:space="preserve"> usually, In the morning, breakfast, In the evening, </w:t>
-      </w:r>
-      <w:r>
-        <w:rPr>
-          <w:sz w:val="28"/>
-          <w:szCs w:val="28"/>
-        </w:rPr>
-        <w:t>get up</w:t>
+        <w:t xml:space="preserve"> </w:t>
+      </w:r>
+      <w:r>
+        <w:rPr>
+          <w:sz w:val="28"/>
+          <w:szCs w:val="28"/>
+        </w:rPr>
+        <w:t>sick</w:t>
+      </w:r>
+      <w:r>
+        <w:rPr>
+          <w:sz w:val="28"/>
+          <w:szCs w:val="28"/>
+        </w:rPr>
+        <w:t xml:space="preserve">, </w:t>
+      </w:r>
+      <w:r>
+        <w:rPr>
+          <w:sz w:val="28"/>
+          <w:szCs w:val="28"/>
+        </w:rPr>
+        <w:t>doctor</w:t>
+      </w:r>
+      <w:r>
+        <w:rPr>
+          <w:sz w:val="28"/>
+          <w:szCs w:val="28"/>
+        </w:rPr>
+        <w:t xml:space="preserve">, </w:t>
+      </w:r>
+      <w:r>
+        <w:rPr>
+          <w:sz w:val="28"/>
+          <w:szCs w:val="28"/>
+        </w:rPr>
+        <w:t>help</w:t>
+      </w:r>
+      <w:r>
+        <w:rPr>
+          <w:sz w:val="28"/>
+          <w:szCs w:val="28"/>
+        </w:rPr>
+        <w:t xml:space="preserve">, </w:t>
+      </w:r>
+      <w:r>
+        <w:rPr>
+          <w:sz w:val="28"/>
+          <w:szCs w:val="28"/>
+        </w:rPr>
+        <w:t>happy</w:t>
+      </w:r>
+      <w:r>
+        <w:rPr>
+          <w:sz w:val="28"/>
+          <w:szCs w:val="28"/>
+        </w:rPr>
+        <w:t xml:space="preserve">, </w:t>
+      </w:r>
+      <w:r>
+        <w:rPr>
+          <w:sz w:val="28"/>
+          <w:szCs w:val="28"/>
+        </w:rPr>
+        <w:t>want</w:t>
       </w:r>
       <w:r>
         <w:rPr>

</xml_diff>